<commit_message>
Actualizar cronogramas de Juliano
</commit_message>
<xml_diff>
--- a/juliano/cronogramas/Cronograma_Informatica_Semana5_IUTECP.docx
+++ b/juliano/cronogramas/Cronograma_Informatica_Semana5_IUTECP.docx
@@ -181,7 +181,7 @@
           <w:b w:val="0"/>
           <w:sz w:val="24"/>
         </w:rPr>
-        <w:t>Completar los módulos visuales de consulta e historial de movimientos del sistema, e integrar la lógica de visualización dinámica de expedientes por proceso administrativo, asistiendo en paralelo en las labores de revisión y canalización de correspondencia presidencial.</w:t>
+        <w:t>Completar los módulos visuales de consulta e historial de movimientos del sistema, e integrar la lógica de visualización dinámica de expedientes por proceso administrativo, asistiendo en paralelo en las labores de revisión y canalización de expedientes.</w:t>
       </w:r>
     </w:p>
     <w:p/>
@@ -449,7 +449,7 @@
                 <w:b w:val="0"/>
                 <w:sz w:val="20"/>
               </w:rPr>
-              <w:t>Apoyo administrativo en la revisión ortográfica y de formato de oficios recibidos, y canalización hacia el Presidente para su firma y posterior despacho al departamento destinatario.</w:t>
+              <w:t>Apoyo administrativo en la revisión de expedientes recibidos, canalización para su firma y posterior despacho al departamento destinatario.</w:t>
             </w:r>
           </w:p>
         </w:tc>
@@ -535,7 +535,7 @@
                 <w:b w:val="0"/>
                 <w:sz w:val="20"/>
               </w:rPr>
-              <w:t>Implementación del panel de historial que muestra la línea de tiempo completa de cada expediente: fecha de ingreso, revisión, firma y egreso, con indicación del responsable de cada etapa.</w:t>
+              <w:t>Implementación del panel de historial que muestra la línea de tiempo completa de cada expediente, con indicación del responsable de cada etapa.</w:t>
             </w:r>
           </w:p>
         </w:tc>
@@ -621,7 +621,7 @@
                 <w:b w:val="0"/>
                 <w:sz w:val="20"/>
               </w:rPr>
-              <w:t>Ejecución de casos de prueba sobre el módulo de búsqueda utilizando datos reales de expedientes registrados en semanas anteriores, verificando la exactitud y rapidez de los resultados.</w:t>
+              <w:t>Ejecución de casos de prueba sobre el módulo de búsqueda utilizando datos reales de expedientes registrados en semanas anteriores, verificando la integridad de los resultados.</w:t>
             </w:r>
           </w:p>
         </w:tc>
@@ -642,7 +642,7 @@
                 <w:b w:val="0"/>
                 <w:sz w:val="20"/>
               </w:rPr>
-              <w:t>Equipo informático, datos históricos de la base de datos</w:t>
+              <w:t>Datos históricos de la base de datos</w:t>
             </w:r>
           </w:p>
         </w:tc>

</xml_diff>